<commit_message>
bayesian score script + xscan script + other
</commit_message>
<xml_diff>
--- a/01_Manuscript/draft/Manuscript.docx
+++ b/01_Manuscript/draft/Manuscript.docx
@@ -301,7 +301,95 @@
           <w:sz w:val="22"/>
           <w:lang w:val="en-US"/>
         </w:rPr>
-        <w:t xml:space="preserve">: SK, GR, PH and TH SCORE measurements, KH MAGEA3 project management, </w:t>
+        <w:t>:</w:t>
+      </w:r>
+      <w:r>
+        <w:rPr>
+          <w:bCs/>
+          <w:sz w:val="22"/>
+          <w:lang w:val="en-US"/>
+        </w:rPr>
+        <w:t xml:space="preserve"> </w:t>
+      </w:r>
+      <w:r>
+        <w:rPr>
+          <w:bCs/>
+          <w:sz w:val="22"/>
+          <w:lang w:val="en-US"/>
+        </w:rPr>
+        <w:t xml:space="preserve">GR, PH and TH </w:t>
+      </w:r>
+      <w:r>
+        <w:rPr>
+          <w:bCs/>
+          <w:sz w:val="22"/>
+          <w:lang w:val="en-US"/>
+        </w:rPr>
+        <w:t>high</w:t>
+      </w:r>
+      <w:r>
+        <w:rPr>
+          <w:bCs/>
+          <w:sz w:val="22"/>
+          <w:lang w:val="en-US"/>
+        </w:rPr>
+        <w:t>SCORE measurements</w:t>
+      </w:r>
+      <w:r>
+        <w:rPr>
+          <w:bCs/>
+          <w:sz w:val="22"/>
+          <w:lang w:val="en-US"/>
+        </w:rPr>
+        <w:t xml:space="preserve">; </w:t>
+      </w:r>
+      <w:r>
+        <w:rPr>
+          <w:bCs/>
+          <w:sz w:val="22"/>
+          <w:lang w:val="en-US"/>
+        </w:rPr>
+        <w:t xml:space="preserve">AS, </w:t>
+      </w:r>
+      <w:r>
+        <w:rPr>
+          <w:bCs/>
+          <w:sz w:val="22"/>
+          <w:lang w:val="en-US"/>
+        </w:rPr>
+        <w:t>SK</w:t>
+      </w:r>
+      <w:r>
+        <w:rPr>
+          <w:bCs/>
+          <w:sz w:val="22"/>
+          <w:lang w:val="en-US"/>
+        </w:rPr>
+        <w:t xml:space="preserve"> </w:t>
+      </w:r>
+      <w:r>
+        <w:rPr>
+          <w:bCs/>
+          <w:sz w:val="22"/>
+          <w:lang w:val="en-US"/>
+        </w:rPr>
+        <w:t>highSCORE</w:t>
+      </w:r>
+      <w:r>
+        <w:rPr>
+          <w:bCs/>
+          <w:sz w:val="22"/>
+          <w:lang w:val="en-US"/>
+        </w:rPr>
+        <w:t xml:space="preserve"> analysis</w:t>
+      </w:r>
+      <w:r>
+        <w:rPr>
+          <w:bCs/>
+          <w:sz w:val="22"/>
+          <w:lang w:val="en-US"/>
+        </w:rPr>
+        <w:t xml:space="preserve">, KH MAGEA3 project management, </w:t>
       </w:r>
       <w:r>
         <w:rPr>
@@ -335,7 +423,7 @@
           <w:sz w:val="22"/>
           <w:lang w:val="en-US"/>
         </w:rPr>
-        <w:t>MA established PEPREP, HA, SL, OS and JB study design &amp; all other stuff!!</w:t>
+        <w:t>MA established PEPREP, HA, SL, OS and JB study design &amp; other stuff!!</w:t>
       </w:r>
     </w:p>
     <w:p>
@@ -7916,7 +8004,27 @@
           <w:szCs w:val="21"/>
           <w:lang w:val="en-US"/>
         </w:rPr>
-        <w:t>Table 1: position-specific binding metrics and classification for MAGE-A3 peptide, KVAELVHFL. FC_mean: mean fold change in KD upon substitution. Sensitivity: normalized range of KD change. % better thab WT: percentage of substitutions with better KD than target.</w:t>
+        <w:t>Table 1: position-specific binding metrics and classification for MAGE-A3 peptide, KVAELVHFL. FC_mean: mean fold change in KD upon substitution. Sensitivity: normalized range of KD change. % better tha</w:t>
+      </w:r>
+      <w:r>
+        <w:rPr>
+          <w:i/>
+          <w:iCs/>
+          <w:sz w:val="21"/>
+          <w:szCs w:val="21"/>
+          <w:lang w:val="en-US"/>
+        </w:rPr>
+        <w:t>n</w:t>
+      </w:r>
+      <w:r>
+        <w:rPr>
+          <w:i/>
+          <w:iCs/>
+          <w:sz w:val="21"/>
+          <w:szCs w:val="21"/>
+          <w:lang w:val="en-US"/>
+        </w:rPr>
+        <w:t xml:space="preserve"> WT: percentage of substitutions with better KD than target.</w:t>
       </w:r>
     </w:p>
     <w:p>
@@ -8207,7 +8315,7 @@
           <w:szCs w:val="21"/>
           <w:lang w:val="en-US"/>
         </w:rPr>
-        <w:t>. (d) peptides are categorized by their binding affinity to HLA-A*02:01 according to NetMHCpan</w:t>
+        <w:t xml:space="preserve">. (d) peptides are categorized by their binding affinity to HLA-A*02:01 according to </w:t>
       </w:r>
       <w:r>
         <w:rPr>
@@ -8217,7 +8325,27 @@
           <w:szCs w:val="21"/>
           <w:lang w:val="en-US"/>
         </w:rPr>
-        <w:t xml:space="preserve">;~50% of the peptide have moderate to high binding affinity. </w:t>
+        <w:t>NetMHCpan</w:t>
+      </w:r>
+      <w:r>
+        <w:rPr>
+          <w:i/>
+          <w:iCs/>
+          <w:sz w:val="21"/>
+          <w:szCs w:val="21"/>
+          <w:lang w:val="en-US"/>
+        </w:rPr>
+        <w:t>; ~</w:t>
+      </w:r>
+      <w:r>
+        <w:rPr>
+          <w:i/>
+          <w:iCs/>
+          <w:sz w:val="21"/>
+          <w:szCs w:val="21"/>
+          <w:lang w:val="en-US"/>
+        </w:rPr>
+        <w:t xml:space="preserve">50% of the peptide have moderate to high binding affinity. </w:t>
       </w:r>
       <w:r>
         <w:rPr>
@@ -8612,13 +8740,7 @@
           <w:szCs w:val="21"/>
           <w:lang w:val="en-US"/>
         </w:rPr>
-        <w:t>Figure 3: A) peptides with available experimental data according to PEPREP (inhouse source for pHLAs) and IEDB. B) peptides classification according to experimental evidence. C) CDFs of Bi_features score stratified by risk rank (High, Moderate, Low) and anchor status (Intact, Both Anchor &amp; Backbone). anchor_mismatch (n=3) excluded due to small sample size. Dashed lines indicate 50th and 90th percentiles. D)</w:t>
-      </w:r>
-      <w:r>
-        <w:rPr>
-          <w:lang w:val="en-US"/>
-        </w:rPr>
-        <w:t xml:space="preserve"> </w:t>
+        <w:t>Figure 3: A) peptides with available experimental data according to PEPREP (inhouse source for pHLAs) and IEDB.</w:t>
       </w:r>
       <w:r>
         <w:rPr>
@@ -8628,13 +8750,7 @@
           <w:szCs w:val="21"/>
           <w:lang w:val="en-US"/>
         </w:rPr>
-        <w:t>Distributions of Bi_features score (blue) and Multi_features_score (green) across all off-target peptides. Low correlation (r = 0.19) demonstrates orthogonal risk dimensions: Bi_features score quantifies immunological cross-reactivity (sequence similarity and MHC affinity), while Multi_features score integrates physicochemical properties (hydrophobicity, charge, aromaticity, aliphatic index, pI) influencing peptide-MHC stability and TCR recognition, weighted by anchor status. E) Scatter plot comparing Bi_features score and Multi_features score rankings. High Disagreement (green), Top Bi_features (blue), and Top Multi_features (orange) categories highlight peptides prioritized differently by each method. Dashed line indicates perfect rank agreement</w:t>
-      </w:r>
-      <w:r>
-        <w:rPr>
-          <w:lang w:val="en-US"/>
-        </w:rPr>
-        <w:t>.</w:t>
+        <w:t xml:space="preserve"> </w:t>
       </w:r>
       <w:r>
         <w:rPr>
@@ -8644,6 +8760,378 @@
           <w:szCs w:val="21"/>
           <w:lang w:val="en-US"/>
         </w:rPr>
+        <w:t>Accordingly, 80% of the predicted peptides have no previous record, indicating their potential for being novel off-targets.</w:t>
+      </w:r>
+      <w:r>
+        <w:rPr>
+          <w:i/>
+          <w:iCs/>
+          <w:sz w:val="21"/>
+          <w:szCs w:val="21"/>
+          <w:lang w:val="en-US"/>
+        </w:rPr>
+        <w:t xml:space="preserve"> B) peptides classification according to experimental evidence</w:t>
+      </w:r>
+      <w:r>
+        <w:rPr>
+          <w:i/>
+          <w:iCs/>
+          <w:sz w:val="21"/>
+          <w:szCs w:val="21"/>
+          <w:lang w:val="en-US"/>
+        </w:rPr>
+        <w:t>: once the experimental data obtained from IEDB and PEPREP is leveraged, peptides were classified by their context relevance to this study, ~11% were of high relevance, as their relevance is being observed in normal tissues and with strong binding evidence to HLA-A*02:01</w:t>
+      </w:r>
+      <w:r>
+        <w:rPr>
+          <w:i/>
+          <w:iCs/>
+          <w:sz w:val="21"/>
+          <w:szCs w:val="21"/>
+          <w:lang w:val="en-US"/>
+        </w:rPr>
+        <w:t>. C) CDFs of Bi_features score stratified by risk rank (High, Moderate, Low)</w:t>
+      </w:r>
+      <w:r>
+        <w:rPr>
+          <w:i/>
+          <w:iCs/>
+          <w:sz w:val="21"/>
+          <w:szCs w:val="21"/>
+          <w:lang w:val="en-US"/>
+        </w:rPr>
+        <w:t xml:space="preserve"> according to k-mer method,</w:t>
+      </w:r>
+      <w:r>
+        <w:rPr>
+          <w:i/>
+          <w:iCs/>
+          <w:sz w:val="21"/>
+          <w:szCs w:val="21"/>
+          <w:lang w:val="en-US"/>
+        </w:rPr>
+        <w:t xml:space="preserve"> and anchor status (Intact, Both Anchor &amp; Backbone). </w:t>
+      </w:r>
+      <w:r>
+        <w:rPr>
+          <w:i/>
+          <w:iCs/>
+          <w:sz w:val="21"/>
+          <w:szCs w:val="21"/>
+          <w:lang w:val="en-US"/>
+        </w:rPr>
+        <w:t xml:space="preserve">Peptides with mismatches at </w:t>
+      </w:r>
+      <w:r>
+        <w:rPr>
+          <w:i/>
+          <w:iCs/>
+          <w:sz w:val="21"/>
+          <w:szCs w:val="21"/>
+          <w:lang w:val="en-US"/>
+        </w:rPr>
+        <w:t>ancho</w:t>
+      </w:r>
+      <w:r>
+        <w:rPr>
+          <w:i/>
+          <w:iCs/>
+          <w:sz w:val="21"/>
+          <w:szCs w:val="21"/>
+          <w:lang w:val="en-US"/>
+        </w:rPr>
+        <w:t>r positions</w:t>
+      </w:r>
+      <w:r>
+        <w:rPr>
+          <w:i/>
+          <w:iCs/>
+          <w:sz w:val="21"/>
+          <w:szCs w:val="21"/>
+          <w:lang w:val="en-US"/>
+        </w:rPr>
+        <w:t xml:space="preserve"> (n=3) </w:t>
+      </w:r>
+      <w:r>
+        <w:rPr>
+          <w:i/>
+          <w:iCs/>
+          <w:sz w:val="21"/>
+          <w:szCs w:val="21"/>
+          <w:lang w:val="en-US"/>
+        </w:rPr>
+        <w:t xml:space="preserve">were </w:t>
+      </w:r>
+      <w:r>
+        <w:rPr>
+          <w:i/>
+          <w:iCs/>
+          <w:sz w:val="21"/>
+          <w:szCs w:val="21"/>
+          <w:lang w:val="en-US"/>
+        </w:rPr>
+        <w:t>excluded due to small sample size. Dashed lines indicate 50th and 90th percentiles. D)</w:t>
+      </w:r>
+      <w:r>
+        <w:rPr>
+          <w:lang w:val="en-US"/>
+        </w:rPr>
+        <w:t xml:space="preserve"> </w:t>
+      </w:r>
+      <w:r>
+        <w:rPr>
+          <w:i/>
+          <w:iCs/>
+          <w:sz w:val="21"/>
+          <w:szCs w:val="21"/>
+          <w:lang w:val="en-US"/>
+        </w:rPr>
+        <w:t xml:space="preserve">histograms </w:t>
+      </w:r>
+      <w:r>
+        <w:rPr>
+          <w:i/>
+          <w:iCs/>
+          <w:sz w:val="21"/>
+          <w:szCs w:val="21"/>
+          <w:lang w:val="en-US"/>
+        </w:rPr>
+        <w:t xml:space="preserve">of Bi_features </w:t>
+      </w:r>
+      <w:r>
+        <w:rPr>
+          <w:i/>
+          <w:iCs/>
+          <w:sz w:val="21"/>
+          <w:szCs w:val="21"/>
+          <w:lang w:val="en-US"/>
+        </w:rPr>
+        <w:t>score,</w:t>
+      </w:r>
+      <w:r>
+        <w:rPr>
+          <w:i/>
+          <w:iCs/>
+          <w:sz w:val="21"/>
+          <w:szCs w:val="21"/>
+          <w:lang w:val="en-US"/>
+        </w:rPr>
+        <w:t xml:space="preserve"> and Multi_features</w:t>
+      </w:r>
+      <w:r>
+        <w:rPr>
+          <w:i/>
+          <w:iCs/>
+          <w:sz w:val="21"/>
+          <w:szCs w:val="21"/>
+          <w:lang w:val="en-US"/>
+        </w:rPr>
+        <w:t xml:space="preserve"> </w:t>
+      </w:r>
+      <w:r>
+        <w:rPr>
+          <w:i/>
+          <w:iCs/>
+          <w:sz w:val="21"/>
+          <w:szCs w:val="21"/>
+          <w:lang w:val="en-US"/>
+        </w:rPr>
+        <w:t>score across all off-target peptides. Low correlation (</w:t>
+      </w:r>
+      <w:r>
+        <w:rPr>
+          <w:i/>
+          <w:iCs/>
+          <w:sz w:val="21"/>
+          <w:szCs w:val="21"/>
+          <w:lang w:val="en-US"/>
+        </w:rPr>
+        <w:t>ρ</w:t>
+      </w:r>
+      <w:r>
+        <w:rPr>
+          <w:i/>
+          <w:iCs/>
+          <w:sz w:val="21"/>
+          <w:szCs w:val="21"/>
+          <w:lang w:val="en-US"/>
+        </w:rPr>
+        <w:t xml:space="preserve"> = 0.19) demonstrates orthogonal risk dimensions: Bi_features score quantifies immunological cross-reactivity (sequence similarity and MHC affinity), while Multi_features score integrates physicochemical properties (hydrophobicity, charge, aromaticity, aliphatic index, pI) influencing peptide-MHC stability and TCR recognition, weighted by anchor status. E) Scatter plot comparing </w:t>
+      </w:r>
+      <w:r>
+        <w:rPr>
+          <w:i/>
+          <w:iCs/>
+          <w:sz w:val="21"/>
+          <w:szCs w:val="21"/>
+          <w:lang w:val="en-US"/>
+        </w:rPr>
+        <w:t xml:space="preserve">the ranked </w:t>
+      </w:r>
+      <w:r>
+        <w:rPr>
+          <w:i/>
+          <w:iCs/>
+          <w:sz w:val="21"/>
+          <w:szCs w:val="21"/>
+          <w:lang w:val="en-US"/>
+        </w:rPr>
+        <w:t xml:space="preserve">Bi_features and Multi_features </w:t>
+      </w:r>
+      <w:r>
+        <w:rPr>
+          <w:i/>
+          <w:iCs/>
+          <w:sz w:val="21"/>
+          <w:szCs w:val="21"/>
+          <w:lang w:val="en-US"/>
+        </w:rPr>
+        <w:t>scor</w:t>
+      </w:r>
+      <w:r>
+        <w:rPr>
+          <w:i/>
+          <w:iCs/>
+          <w:sz w:val="21"/>
+          <w:szCs w:val="21"/>
+          <w:lang w:val="en-US"/>
+        </w:rPr>
+        <w:t>es</w:t>
+      </w:r>
+      <w:r>
+        <w:rPr>
+          <w:i/>
+          <w:iCs/>
+          <w:sz w:val="21"/>
+          <w:szCs w:val="21"/>
+          <w:lang w:val="en-US"/>
+        </w:rPr>
+        <w:t>. High Disagreement (</w:t>
+      </w:r>
+      <w:r>
+        <w:rPr>
+          <w:i/>
+          <w:iCs/>
+          <w:sz w:val="21"/>
+          <w:szCs w:val="21"/>
+          <w:lang w:val="en-US"/>
+        </w:rPr>
+        <w:t>upper-left and bottom-right corners</w:t>
+      </w:r>
+      <w:r>
+        <w:rPr>
+          <w:i/>
+          <w:iCs/>
+          <w:sz w:val="21"/>
+          <w:szCs w:val="21"/>
+          <w:lang w:val="en-US"/>
+        </w:rPr>
+        <w:t>), Top Bi_features (</w:t>
+      </w:r>
+      <w:r>
+        <w:rPr>
+          <w:i/>
+          <w:iCs/>
+          <w:sz w:val="21"/>
+          <w:szCs w:val="21"/>
+          <w:lang w:val="en-US"/>
+        </w:rPr>
+        <w:t>lie on the y-axis with x value = 0</w:t>
+      </w:r>
+      <w:r>
+        <w:rPr>
+          <w:i/>
+          <w:iCs/>
+          <w:sz w:val="21"/>
+          <w:szCs w:val="21"/>
+          <w:lang w:val="en-US"/>
+        </w:rPr>
+        <w:t xml:space="preserve">), and Top Multi_features </w:t>
+      </w:r>
+      <w:r>
+        <w:rPr>
+          <w:i/>
+          <w:iCs/>
+          <w:sz w:val="21"/>
+          <w:szCs w:val="21"/>
+          <w:lang w:val="en-US"/>
+        </w:rPr>
+        <w:t>(</w:t>
+      </w:r>
+      <w:r>
+        <w:rPr>
+          <w:i/>
+          <w:iCs/>
+          <w:sz w:val="21"/>
+          <w:szCs w:val="21"/>
+          <w:lang w:val="en-US"/>
+        </w:rPr>
+        <w:t xml:space="preserve">lie on the </w:t>
+      </w:r>
+      <w:r>
+        <w:rPr>
+          <w:i/>
+          <w:iCs/>
+          <w:sz w:val="21"/>
+          <w:szCs w:val="21"/>
+          <w:lang w:val="en-US"/>
+        </w:rPr>
+        <w:t>x</w:t>
+      </w:r>
+      <w:r>
+        <w:rPr>
+          <w:i/>
+          <w:iCs/>
+          <w:sz w:val="21"/>
+          <w:szCs w:val="21"/>
+          <w:lang w:val="en-US"/>
+        </w:rPr>
+        <w:t xml:space="preserve">-axis with </w:t>
+      </w:r>
+      <w:r>
+        <w:rPr>
+          <w:i/>
+          <w:iCs/>
+          <w:sz w:val="21"/>
+          <w:szCs w:val="21"/>
+          <w:lang w:val="en-US"/>
+        </w:rPr>
+        <w:t>y-</w:t>
+      </w:r>
+      <w:r>
+        <w:rPr>
+          <w:i/>
+          <w:iCs/>
+          <w:sz w:val="21"/>
+          <w:szCs w:val="21"/>
+          <w:lang w:val="en-US"/>
+        </w:rPr>
+        <w:t>value = 0</w:t>
+      </w:r>
+      <w:r>
+        <w:rPr>
+          <w:i/>
+          <w:iCs/>
+          <w:sz w:val="21"/>
+          <w:szCs w:val="21"/>
+          <w:lang w:val="en-US"/>
+        </w:rPr>
+        <w:t>) categories highlight peptides prioritized differently by each method. Dashed line indicates perfect rank agreement</w:t>
+      </w:r>
+      <w:r>
+        <w:rPr>
+          <w:lang w:val="en-US"/>
+        </w:rPr>
+        <w:t>.</w:t>
+      </w:r>
+      <w:r>
+        <w:rPr>
+          <w:i/>
+          <w:iCs/>
+          <w:sz w:val="21"/>
+          <w:szCs w:val="21"/>
+          <w:lang w:val="en-US"/>
+        </w:rPr>
         <w:t xml:space="preserve"> </w:t>
       </w:r>
     </w:p>
@@ -8726,14 +9214,8 @@
         <w:rPr>
           <w:lang w:val="en-US"/>
         </w:rPr>
-        <w:t xml:space="preserve">We recognize that peptides reported in previous studies may lack allele specificity, and sometime having been observed binding to multiple alleles. Moreover, experimental evidence for binding to the allele of interest is extremely context-dependent. Therefore, we developed a contextual risk intelligence approach using Bayesian algorithm (See methods: PrediTopes) to </w:t>
-      </w:r>
-      <w:r>
-        <w:rPr>
-          <w:lang w:val="en-US"/>
-        </w:rPr>
         <w:lastRenderedPageBreak/>
-        <w:t xml:space="preserve">distinguish peptides with strong experimental evidence from novel peptides not previously reported in experimental studies or MHC databases. </w:t>
+        <w:t xml:space="preserve">We recognize that peptides reported in previous studies may lack allele specificity, and sometime having been observed binding to multiple alleles. Moreover, experimental evidence for binding to the allele of interest is extremely context-dependent. Therefore, we developed a contextual risk intelligence approach using Bayesian algorithm (See methods: PrediTopes) to distinguish peptides with strong experimental evidence from novel peptides not previously reported in experimental studies or MHC databases. </w:t>
       </w:r>
       <w:commentRangeEnd w:id="87"/>
       <w:r>
@@ -9049,14 +9531,14 @@
         <w:rPr>
           <w:lang w:val="en-US"/>
         </w:rPr>
-        <w:t xml:space="preserve">Our therapeutic target, MAGE-A3 (P43357), shares an identical peptide sequence with MAGE-A9 (P43362), a potential cross-reactive off-target. Sequence-based methods (similarity scoring, structural prediction, physicochemical properties) cannot distinguish these peptides. However, our evidence-based framework differentiated them substantially (LR products: 10,000 vs 270) based on experimental validation contexts: MAGE-A3 showed strong binding in normal tissue studies, while MAGE-A9 demonstrated intermediate binding </w:t>
+        <w:t xml:space="preserve">Our therapeutic target, MAGE-A3 (P43357), shares an identical peptide sequence with MAGE-A9 (P43362), a potential cross-reactive off-target. Sequence-based methods </w:t>
       </w:r>
       <w:r>
         <w:rPr>
           <w:lang w:val="en-US"/>
         </w:rPr>
         <w:lastRenderedPageBreak/>
-        <w:t>exclusively in cancer contexts. Both achieved High evidence classifications, but with 37-fold difference in cumulative evidence strength reflecting distinct experimental profiles. This demonstrates how context-aware evidence aggregation provides discriminatory power beyond sequence-level analysis, enabling informed prioritization even among structurally identical epitopes (</w:t>
+        <w:t>(similarity scoring, structural prediction, physicochemical properties) cannot distinguish these peptides. However, our evidence-based framework differentiated them substantially (LR products: 10,000 vs 270) based on experimental validation contexts: MAGE-A3 showed strong binding in normal tissue studies, while MAGE-A9 demonstrated intermediate binding exclusively in cancer contexts. Both achieved High evidence classifications, but with 37-fold difference in cumulative evidence strength reflecting distinct experimental profiles. This demonstrates how context-aware evidence aggregation provides discriminatory power beyond sequence-level analysis, enabling informed prioritization even among structurally identical epitopes (</w:t>
       </w:r>
       <w:r>
         <w:rPr>
@@ -9284,7 +9766,14 @@
         <w:rPr>
           <w:lang w:val="en-US"/>
         </w:rPr>
-        <w:t xml:space="preserve">We then checked whether our ranking method captures biologically relevant off-targets, we examined the scores assigned to 18 previously reported/validated off-target peptides [CITE]. Among these known peptides, 17 peptides were classified as high risk and 1 as medium risk. Specifically, the rank score of MAGEA9 was 1 as it has the exact same target sequence; the peptides previously reported and speculated to be involved in fatal neurotoxic cases EPS8L2 and MAGEA12 [CITE] (0.9 and 0.87 respectively) due to slightly different similarity and affinity. Notably, PPP2R1B was the only peptide from the known list and the only peptide that has three mismatches exclusively at the anchor positions that was assigned a moderate risk 0.47 demonstrating that the Bi-feature score was sensitive to mismatches that compromise the forming of pHLA. </w:t>
+        <w:t xml:space="preserve">We then checked whether our ranking method captures biologically relevant off-targets, we examined the scores assigned to 18 previously reported/validated off-target peptides [CITE]. Among these known peptides, 17 peptides were classified as high risk and 1 as medium risk. Specifically, the rank score of MAGEA9 was 1 as it has the exact same target sequence; the peptides previously reported and speculated to be involved in fatal neurotoxic cases EPS8L2 and MAGEA12 [CITE] (0.9 and 0.87 respectively) due to slightly different similarity and affinity. Notably, PPP2R1B was the only peptide from the known list and the only peptide </w:t>
+      </w:r>
+      <w:r>
+        <w:rPr>
+          <w:lang w:val="en-US"/>
+        </w:rPr>
+        <w:lastRenderedPageBreak/>
+        <w:t xml:space="preserve">that has three mismatches exclusively at the anchor positions that was assigned a moderate risk 0.47 demonstrating that the Bi-feature score was sensitive to mismatches that compromise the forming of pHLA. </w:t>
       </w:r>
     </w:p>
     <w:p>
@@ -9298,7 +9787,6 @@
         <w:rPr>
           <w:lang w:val="en-US"/>
         </w:rPr>
-        <w:lastRenderedPageBreak/>
         <w:t>Overall, this distribution demonstrates that our affinity-similarity ranking effectively prioritizes peptides with established off-target potential.</w:t>
       </w:r>
     </w:p>
@@ -9698,15 +10186,11 @@
         </w:rPr>
       </w:pPr>
       <w:r>
-        <w:rPr>
-          <w:noProof/>
-          <w:lang w:val="en-US"/>
-        </w:rPr>
         <w:drawing>
-          <wp:inline distT="0" distB="0" distL="0" distR="0" wp14:anchorId="7F8667E1" wp14:editId="624C2B7B">
-            <wp:extent cx="5760720" cy="2964180"/>
+          <wp:inline distT="0" distB="0" distL="0" distR="0" wp14:anchorId="4F069C09" wp14:editId="1373E53D">
+            <wp:extent cx="5760720" cy="2954020"/>
             <wp:effectExtent l="0" t="0" r="5080" b="0"/>
-            <wp:docPr id="721574944" name="Grafik 1"/>
+            <wp:docPr id="1619654262" name="Grafik 1"/>
             <wp:cNvGraphicFramePr>
               <a:graphicFrameLocks xmlns:a="http://schemas.openxmlformats.org/drawingml/2006/main" noChangeAspect="1"/>
             </wp:cNvGraphicFramePr>
@@ -9714,7 +10198,7 @@
               <a:graphicData uri="http://schemas.openxmlformats.org/drawingml/2006/picture">
                 <pic:pic xmlns:pic="http://schemas.openxmlformats.org/drawingml/2006/picture">
                   <pic:nvPicPr>
-                    <pic:cNvPr id="721574944" name=""/>
+                    <pic:cNvPr id="1619654262" name=""/>
                     <pic:cNvPicPr/>
                   </pic:nvPicPr>
                   <pic:blipFill>
@@ -9726,7 +10210,7 @@
                   <pic:spPr>
                     <a:xfrm>
                       <a:off x="0" y="0"/>
-                      <a:ext cx="5760720" cy="2964180"/>
+                      <a:ext cx="5760720" cy="2954020"/>
                     </a:xfrm>
                     <a:prstGeom prst="rect">
                       <a:avLst/>
@@ -9757,11 +10241,9 @@
           <w:szCs w:val="20"/>
           <w:lang w:val="en-US"/>
         </w:rPr>
-        <w:t xml:space="preserve">Figure 4: A)?? B) experimental design and etc. C) comprehensive heatmap of binders </w:t>
-      </w:r>
-    </w:p>
-    <w:p>
-      <w:pPr>
+        <w:t xml:space="preserve">Figure 4: </w:t>
+      </w:r>
+      <w:r>
         <w:rPr>
           <w:i/>
           <w:iCs/>
@@ -9769,7 +10251,585 @@
           <w:szCs w:val="20"/>
           <w:lang w:val="en-US"/>
         </w:rPr>
-      </w:pPr>
+        <w:t>Experimental validation of EpiTox predicted peptides.</w:t>
+      </w:r>
+      <w:r>
+        <w:t xml:space="preserve"> </w:t>
+      </w:r>
+      <w:r>
+        <w:rPr>
+          <w:i/>
+          <w:iCs/>
+          <w:sz w:val="20"/>
+          <w:szCs w:val="20"/>
+          <w:lang w:val="en-US"/>
+        </w:rPr>
+        <w:t xml:space="preserve">A decision matrix was generated to prioritize peptides for validation using highSCORE. </w:t>
+      </w:r>
+      <w:r>
+        <w:rPr>
+          <w:b/>
+          <w:bCs/>
+          <w:i/>
+          <w:iCs/>
+          <w:sz w:val="20"/>
+          <w:szCs w:val="20"/>
+          <w:lang w:val="en-US"/>
+        </w:rPr>
+        <w:t>A)</w:t>
+      </w:r>
+      <w:r>
+        <w:rPr>
+          <w:i/>
+          <w:iCs/>
+          <w:sz w:val="20"/>
+          <w:szCs w:val="20"/>
+          <w:lang w:val="en-US"/>
+        </w:rPr>
+        <w:t xml:space="preserve"> Proportions of predicted versus tested peptides across different classification categories. The stacked bar charts show the distribution of </w:t>
+      </w:r>
+      <w:r>
+        <w:rPr>
+          <w:i/>
+          <w:iCs/>
+          <w:sz w:val="20"/>
+          <w:szCs w:val="20"/>
+          <w:lang w:val="en-US"/>
+        </w:rPr>
+        <w:t>position-specific mismatch related to the target,</w:t>
+      </w:r>
+      <w:r>
+        <w:rPr>
+          <w:i/>
+          <w:iCs/>
+          <w:sz w:val="20"/>
+          <w:szCs w:val="20"/>
+          <w:lang w:val="en-US"/>
+        </w:rPr>
+        <w:t xml:space="preserve"> experimental evidence levels, multi-feature rank categories, and wildtype versus SNP-derived peptide status. </w:t>
+      </w:r>
+      <w:r>
+        <w:rPr>
+          <w:b/>
+          <w:bCs/>
+          <w:i/>
+          <w:iCs/>
+          <w:sz w:val="20"/>
+          <w:szCs w:val="20"/>
+          <w:lang w:val="en-US"/>
+        </w:rPr>
+        <w:t>B)</w:t>
+      </w:r>
+      <w:r>
+        <w:rPr>
+          <w:i/>
+          <w:iCs/>
+          <w:sz w:val="20"/>
+          <w:szCs w:val="20"/>
+          <w:lang w:val="en-US"/>
+        </w:rPr>
+        <w:t xml:space="preserve"> Complex heatmap showing gene expression profiles across multiple tissues for confirmed binders according to highSCORE. Gene expression values are displayed as log2 fold-change relative to </w:t>
+      </w:r>
+      <w:r>
+        <w:rPr>
+          <w:i/>
+          <w:iCs/>
+          <w:sz w:val="20"/>
+          <w:szCs w:val="20"/>
+          <w:lang w:val="en-US"/>
+        </w:rPr>
+        <w:t xml:space="preserve">target </w:t>
+      </w:r>
+      <w:r>
+        <w:rPr>
+          <w:i/>
+          <w:iCs/>
+          <w:sz w:val="20"/>
+          <w:szCs w:val="20"/>
+          <w:lang w:val="en-US"/>
+        </w:rPr>
+        <w:t xml:space="preserve">expression in the tissue. Top annotations from outermost to heatmap: </w:t>
+      </w:r>
+      <w:r>
+        <w:rPr>
+          <w:i/>
+          <w:iCs/>
+          <w:sz w:val="20"/>
+          <w:szCs w:val="20"/>
+          <w:lang w:val="en-US"/>
+        </w:rPr>
+        <w:t>disclosed peptide</w:t>
+      </w:r>
+      <w:r>
+        <w:rPr>
+          <w:i/>
+          <w:iCs/>
+          <w:sz w:val="20"/>
+          <w:szCs w:val="20"/>
+          <w:lang w:val="en-US"/>
+        </w:rPr>
+        <w:t xml:space="preserve"> (</w:t>
+      </w:r>
+      <w:r>
+        <w:rPr>
+          <w:i/>
+          <w:iCs/>
+          <w:sz w:val="20"/>
+          <w:szCs w:val="20"/>
+          <w:lang w:val="en-US"/>
+        </w:rPr>
+        <w:t>disclosed peptide</w:t>
+      </w:r>
+      <w:r>
+        <w:rPr>
+          <w:i/>
+          <w:iCs/>
+          <w:sz w:val="20"/>
+          <w:szCs w:val="20"/>
+          <w:lang w:val="en-US"/>
+        </w:rPr>
+        <w:t xml:space="preserve"> </w:t>
+      </w:r>
+      <w:r>
+        <w:rPr>
+          <w:i/>
+          <w:iCs/>
+          <w:sz w:val="20"/>
+          <w:szCs w:val="20"/>
+          <w:lang w:val="en-US"/>
+        </w:rPr>
+        <w:t>versus</w:t>
+      </w:r>
+      <w:r>
+        <w:rPr>
+          <w:i/>
+          <w:iCs/>
+          <w:sz w:val="20"/>
+          <w:szCs w:val="20"/>
+          <w:lang w:val="en-US"/>
+        </w:rPr>
+        <w:t xml:space="preserve"> </w:t>
+      </w:r>
+      <w:r>
+        <w:rPr>
+          <w:i/>
+          <w:iCs/>
+          <w:sz w:val="20"/>
+          <w:szCs w:val="20"/>
+          <w:lang w:val="en-US"/>
+        </w:rPr>
+        <w:t xml:space="preserve">not </w:t>
+      </w:r>
+      <w:r>
+        <w:rPr>
+          <w:i/>
+          <w:iCs/>
+          <w:sz w:val="20"/>
+          <w:szCs w:val="20"/>
+          <w:lang w:val="en-US"/>
+        </w:rPr>
+        <w:t>disclosed peptide</w:t>
+      </w:r>
+      <w:r>
+        <w:rPr>
+          <w:i/>
+          <w:iCs/>
+          <w:sz w:val="20"/>
+          <w:szCs w:val="20"/>
+          <w:lang w:val="en-US"/>
+        </w:rPr>
+        <w:t xml:space="preserve">); </w:t>
+      </w:r>
+      <w:r>
+        <w:rPr>
+          <w:i/>
+          <w:iCs/>
+          <w:sz w:val="20"/>
+          <w:szCs w:val="20"/>
+          <w:lang w:val="en-US"/>
+        </w:rPr>
+        <w:t>Anchor status</w:t>
+      </w:r>
+      <w:r>
+        <w:rPr>
+          <w:i/>
+          <w:iCs/>
+          <w:sz w:val="20"/>
+          <w:szCs w:val="20"/>
+          <w:lang w:val="en-US"/>
+        </w:rPr>
+        <w:t xml:space="preserve"> (</w:t>
+      </w:r>
+      <w:r>
+        <w:rPr>
+          <w:i/>
+          <w:iCs/>
+          <w:sz w:val="20"/>
+          <w:szCs w:val="20"/>
+          <w:lang w:val="en-US"/>
+        </w:rPr>
+        <w:t>Anchor intact, mismatch, backbone and anchor</w:t>
+      </w:r>
+      <w:r>
+        <w:rPr>
+          <w:i/>
+          <w:iCs/>
+          <w:sz w:val="20"/>
+          <w:szCs w:val="20"/>
+          <w:lang w:val="en-US"/>
+        </w:rPr>
+        <w:t>);</w:t>
+      </w:r>
+      <w:r>
+        <w:rPr>
+          <w:i/>
+          <w:iCs/>
+          <w:sz w:val="20"/>
+          <w:szCs w:val="20"/>
+          <w:lang w:val="en-US"/>
+        </w:rPr>
+        <w:t xml:space="preserve"> </w:t>
+      </w:r>
+      <w:r>
+        <w:rPr>
+          <w:i/>
+          <w:iCs/>
+          <w:sz w:val="20"/>
+          <w:szCs w:val="20"/>
+          <w:lang w:val="en-US"/>
+        </w:rPr>
+        <w:t>wildtype (WT) v</w:t>
+      </w:r>
+      <w:r>
+        <w:rPr>
+          <w:i/>
+          <w:iCs/>
+          <w:sz w:val="20"/>
+          <w:szCs w:val="20"/>
+          <w:lang w:val="en-US"/>
+        </w:rPr>
+        <w:t>er</w:t>
+      </w:r>
+      <w:r>
+        <w:rPr>
+          <w:i/>
+          <w:iCs/>
+          <w:sz w:val="20"/>
+          <w:szCs w:val="20"/>
+          <w:lang w:val="en-US"/>
+        </w:rPr>
+        <w:t>s</w:t>
+      </w:r>
+      <w:r>
+        <w:rPr>
+          <w:i/>
+          <w:iCs/>
+          <w:sz w:val="20"/>
+          <w:szCs w:val="20"/>
+          <w:lang w:val="en-US"/>
+        </w:rPr>
+        <w:t>us</w:t>
+      </w:r>
+      <w:r>
+        <w:rPr>
+          <w:i/>
+          <w:iCs/>
+          <w:sz w:val="20"/>
+          <w:szCs w:val="20"/>
+          <w:lang w:val="en-US"/>
+        </w:rPr>
+        <w:t xml:space="preserve"> SNP-derived peptides</w:t>
+      </w:r>
+      <w:r>
+        <w:rPr>
+          <w:i/>
+          <w:iCs/>
+          <w:sz w:val="20"/>
+          <w:szCs w:val="20"/>
+          <w:lang w:val="en-US"/>
+        </w:rPr>
+        <w:t>;</w:t>
+      </w:r>
+      <w:r>
+        <w:rPr>
+          <w:i/>
+          <w:iCs/>
+          <w:sz w:val="20"/>
+          <w:szCs w:val="20"/>
+          <w:lang w:val="en-US"/>
+        </w:rPr>
+        <w:t xml:space="preserve"> log2</w:t>
+      </w:r>
+      <w:r>
+        <w:rPr>
+          <w:i/>
+          <w:iCs/>
+          <w:sz w:val="20"/>
+          <w:szCs w:val="20"/>
+          <w:lang w:val="en-US"/>
+        </w:rPr>
+        <w:t>(KD_target)</w:t>
+      </w:r>
+      <w:r>
+        <w:rPr>
+          <w:i/>
+          <w:iCs/>
+          <w:sz w:val="20"/>
+          <w:szCs w:val="20"/>
+          <w:lang w:val="en-US"/>
+        </w:rPr>
+        <w:t xml:space="preserve"> (log2-transformed KD fold-change relative to target</w:t>
+      </w:r>
+      <w:r>
+        <w:rPr>
+          <w:i/>
+          <w:iCs/>
+          <w:sz w:val="20"/>
+          <w:szCs w:val="20"/>
+          <w:lang w:val="en-US"/>
+        </w:rPr>
+        <w:t>;</w:t>
+      </w:r>
+      <w:r>
+        <w:rPr>
+          <w:i/>
+          <w:iCs/>
+          <w:sz w:val="20"/>
+          <w:szCs w:val="20"/>
+          <w:lang w:val="en-US"/>
+        </w:rPr>
+        <w:t xml:space="preserve"> negative values indicate lower binding affinity compared to target, positive values indicate higher affinity</w:t>
+      </w:r>
+      <w:r>
+        <w:rPr>
+          <w:i/>
+          <w:iCs/>
+          <w:sz w:val="20"/>
+          <w:szCs w:val="20"/>
+          <w:lang w:val="en-US"/>
+        </w:rPr>
+        <w:t>)</w:t>
+      </w:r>
+      <w:r>
+        <w:rPr>
+          <w:i/>
+          <w:iCs/>
+          <w:sz w:val="20"/>
+          <w:szCs w:val="20"/>
+          <w:lang w:val="en-US"/>
+        </w:rPr>
+        <w:t xml:space="preserve">; </w:t>
+      </w:r>
+      <w:r>
+        <w:rPr>
+          <w:i/>
+          <w:iCs/>
+          <w:sz w:val="20"/>
+          <w:szCs w:val="20"/>
+          <w:lang w:val="en-US"/>
+        </w:rPr>
+        <w:t>bar plot</w:t>
+      </w:r>
+      <w:r>
+        <w:rPr>
+          <w:i/>
+          <w:iCs/>
+          <w:sz w:val="20"/>
+          <w:szCs w:val="20"/>
+          <w:lang w:val="en-US"/>
+        </w:rPr>
+        <w:t xml:space="preserve"> showing total gene expression</w:t>
+      </w:r>
+      <w:r>
+        <w:rPr>
+          <w:i/>
+          <w:iCs/>
+          <w:sz w:val="20"/>
+          <w:szCs w:val="20"/>
+          <w:lang w:val="en-US"/>
+        </w:rPr>
+        <w:t xml:space="preserve"> (total gxp)</w:t>
+      </w:r>
+      <w:r>
+        <w:rPr>
+          <w:i/>
+          <w:iCs/>
+          <w:sz w:val="20"/>
+          <w:szCs w:val="20"/>
+          <w:lang w:val="en-US"/>
+        </w:rPr>
+        <w:t xml:space="preserve"> summed across tissues per peptide.</w:t>
+      </w:r>
+      <w:r>
+        <w:rPr>
+          <w:i/>
+          <w:iCs/>
+          <w:sz w:val="20"/>
+          <w:szCs w:val="20"/>
+          <w:lang w:val="en-US"/>
+        </w:rPr>
+        <w:t xml:space="preserve"> Bottom </w:t>
+      </w:r>
+      <w:r>
+        <w:rPr>
+          <w:i/>
+          <w:iCs/>
+          <w:sz w:val="20"/>
+          <w:szCs w:val="20"/>
+          <w:lang w:val="en-US"/>
+        </w:rPr>
+        <w:t>annotations indicate: B</w:t>
+      </w:r>
+      <w:r>
+        <w:rPr>
+          <w:i/>
+          <w:iCs/>
+          <w:sz w:val="20"/>
+          <w:szCs w:val="20"/>
+          <w:lang w:val="en-US"/>
+        </w:rPr>
+        <w:t>i-</w:t>
+      </w:r>
+      <w:r>
+        <w:rPr>
+          <w:i/>
+          <w:iCs/>
+          <w:sz w:val="20"/>
+          <w:szCs w:val="20"/>
+          <w:lang w:val="en-US"/>
+        </w:rPr>
+        <w:t>feature</w:t>
+      </w:r>
+      <w:r>
+        <w:rPr>
+          <w:i/>
+          <w:iCs/>
+          <w:sz w:val="20"/>
+          <w:szCs w:val="20"/>
+          <w:lang w:val="en-US"/>
+        </w:rPr>
+        <w:t xml:space="preserve"> </w:t>
+      </w:r>
+      <w:r>
+        <w:rPr>
+          <w:i/>
+          <w:iCs/>
+          <w:sz w:val="20"/>
+          <w:szCs w:val="20"/>
+          <w:lang w:val="en-US"/>
+        </w:rPr>
+        <w:t>rank, Multi</w:t>
+      </w:r>
+      <w:r>
+        <w:rPr>
+          <w:i/>
+          <w:iCs/>
+          <w:sz w:val="20"/>
+          <w:szCs w:val="20"/>
+          <w:lang w:val="en-US"/>
+        </w:rPr>
+        <w:t>-</w:t>
+      </w:r>
+      <w:r>
+        <w:rPr>
+          <w:i/>
+          <w:iCs/>
+          <w:sz w:val="20"/>
+          <w:szCs w:val="20"/>
+          <w:lang w:val="en-US"/>
+        </w:rPr>
+        <w:t>feature</w:t>
+      </w:r>
+      <w:r>
+        <w:rPr>
+          <w:i/>
+          <w:iCs/>
+          <w:sz w:val="20"/>
+          <w:szCs w:val="20"/>
+          <w:lang w:val="en-US"/>
+        </w:rPr>
+        <w:t xml:space="preserve"> </w:t>
+      </w:r>
+      <w:r>
+        <w:rPr>
+          <w:i/>
+          <w:iCs/>
+          <w:sz w:val="20"/>
+          <w:szCs w:val="20"/>
+          <w:lang w:val="en-US"/>
+        </w:rPr>
+        <w:t>rank, and Experimental</w:t>
+      </w:r>
+      <w:r>
+        <w:rPr>
+          <w:i/>
+          <w:iCs/>
+          <w:sz w:val="20"/>
+          <w:szCs w:val="20"/>
+          <w:lang w:val="en-US"/>
+        </w:rPr>
+        <w:t xml:space="preserve"> </w:t>
+      </w:r>
+      <w:r>
+        <w:rPr>
+          <w:i/>
+          <w:iCs/>
+          <w:sz w:val="20"/>
+          <w:szCs w:val="20"/>
+          <w:lang w:val="en-US"/>
+        </w:rPr>
+        <w:t>Evidence</w:t>
+      </w:r>
+      <w:r>
+        <w:rPr>
+          <w:i/>
+          <w:iCs/>
+          <w:sz w:val="20"/>
+          <w:szCs w:val="20"/>
+          <w:lang w:val="en-US"/>
+        </w:rPr>
+        <w:t xml:space="preserve"> </w:t>
+      </w:r>
+      <w:r>
+        <w:rPr>
+          <w:i/>
+          <w:iCs/>
+          <w:sz w:val="20"/>
+          <w:szCs w:val="20"/>
+          <w:lang w:val="en-US"/>
+        </w:rPr>
+        <w:t>anchor</w:t>
+      </w:r>
+      <w:r>
+        <w:rPr>
+          <w:i/>
+          <w:iCs/>
+          <w:sz w:val="20"/>
+          <w:szCs w:val="20"/>
+          <w:lang w:val="en-US"/>
+        </w:rPr>
+        <w:t xml:space="preserve"> </w:t>
+      </w:r>
+      <w:r>
+        <w:rPr>
+          <w:i/>
+          <w:iCs/>
+          <w:sz w:val="20"/>
+          <w:szCs w:val="20"/>
+          <w:lang w:val="en-US"/>
+        </w:rPr>
+        <w:t>status categories, binding feature ranks, multi-feature ranks, experimental evidence levels</w:t>
+      </w:r>
+      <w:r>
+        <w:rPr>
+          <w:i/>
+          <w:iCs/>
+          <w:sz w:val="20"/>
+          <w:szCs w:val="20"/>
+          <w:lang w:val="en-US"/>
+        </w:rPr>
+        <w:t>.</w:t>
+      </w:r>
     </w:p>
     <w:p>
       <w:pPr>
@@ -9841,7 +10901,14 @@
         <w:rPr>
           <w:lang w:val="en-US"/>
         </w:rPr>
-        <w:t xml:space="preserve">In total, 538 peptides were tested using our highSCORE assay (see Methods), exceeding typical experimental validation in computational immunology studies (check selection strategy in Methods, Table XX). Of these, 171 were generated from the X-scan, of which 6 peptides were already identified as off-targets in EpiTox list with exactly one mismatch. In the following sections, we will be discussing the remaining 373 peptides that EpiTox predicted, annotated, and ranked. </w:t>
+        <w:t xml:space="preserve">In total, 538 peptides were tested using our highSCORE assay (see Methods), exceeding typical experimental validation in computational immunology studies (check selection </w:t>
+      </w:r>
+      <w:r>
+        <w:rPr>
+          <w:lang w:val="en-US"/>
+        </w:rPr>
+        <w:lastRenderedPageBreak/>
+        <w:t xml:space="preserve">strategy in Methods, Table XX). Of these, 171 were generated from the X-scan, of which 6 peptides were already identified as off-targets in EpiTox list with exactly one mismatch. In the following sections, we will be discussing the remaining 373 peptides that EpiTox predicted, annotated, and ranked. </w:t>
       </w:r>
     </w:p>
     <w:p>
@@ -9874,14 +10941,7 @@
         <w:rPr>
           <w:lang w:val="en-US"/>
         </w:rPr>
-        <w:t xml:space="preserve"> The distribution of tested versus untested peptides reflects our strategic prioritization: categories with higher proportions of untested peptides represent lower-priority candidates under that particular scoring framework. In total, 37 peptides bound to the </w:t>
-      </w:r>
-      <w:r>
-        <w:rPr>
-          <w:lang w:val="en-US"/>
-        </w:rPr>
-        <w:lastRenderedPageBreak/>
-        <w:t xml:space="preserve">reference antibody. While 11 were previously disclosed as MAGEA3 off-targets, 26 were novel in this context. Notably, our Bayesian scoring method identifies peptides based on MHC databases (IEDB and PEPREP) evidence independent of target identity (figure 4.B), enabling detection of off-targets that may be known for related antigens but overlooked for the specific target of interest. </w:t>
+        <w:t xml:space="preserve"> The distribution of tested versus untested peptides reflects our strategic prioritization: categories with higher proportions of untested peptides represent lower-priority candidates under that particular scoring framework. In total, 37 peptides bound to the reference antibody. While 11 were previously disclosed as MAGEA3 off-targets, 26 were novel in this context. Notably, our Bayesian scoring method identifies peptides based on MHC databases (IEDB and PEPREP) evidence independent of target identity (figure 4.B), enabling detection of off-targets that may be known for related antigens but overlooked for the specific target of interest. </w:t>
       </w:r>
     </w:p>
     <w:p>
@@ -10424,6 +11484,7 @@
           <w:rFonts w:eastAsiaTheme="minorHAnsi"/>
           <w:lang w:val="en-US" w:eastAsia="en-US"/>
         </w:rPr>
+        <w:lastRenderedPageBreak/>
         <w:t>Interestingly, Q5T2L2-FRAELVHPA is the wildtype peptide has moderate affinity to HLA-A*02:01 (KD = 1584.9nM) and moderate similarity to the target (BLOSUM62 = 14); therefore, applying the different logics of our ranking scores disqualified this peptide from testing. However, the SNP-derived version of it, Q5T2L2-FQAELVHPA (SNP = r</w:t>
       </w:r>
       <w:r>
@@ -10437,15 +11498,7 @@
           <w:rFonts w:eastAsiaTheme="minorHAnsi"/>
           <w:lang w:val="en-US" w:eastAsia="en-US"/>
         </w:rPr>
-        <w:t xml:space="preserve">), increased the affinity to hla allele to very high (KD = 23.4nM) and it similarity (BLOSUM62 = 15); this elevation switched the risk of this peptide by Bi-feature score to high-risk group while its rank by Multi-feature score remained unchanged. The peptide therefore was tested and proved to be a binder with almost two-fold decreased affinity to the antibody compared to the target (log2_KD_FC = -0.9). However, the </w:t>
-      </w:r>
-      <w:r>
-        <w:rPr>
-          <w:rFonts w:eastAsiaTheme="minorHAnsi"/>
-          <w:lang w:val="en-US" w:eastAsia="en-US"/>
-        </w:rPr>
-        <w:lastRenderedPageBreak/>
-        <w:t>expression level of its source was at the same target’s level with elevated level in the liver and epididymis (4FC &amp; 2FC respectively) indicating tissue-specific cross-reactivity or side toxicity.</w:t>
+        <w:t>), increased the affinity to hla allele to very high (KD = 23.4nM) and it similarity (BLOSUM62 = 15); this elevation switched the risk of this peptide by Bi-feature score to high-risk group while its rank by Multi-feature score remained unchanged. The peptide therefore was tested and proved to be a binder with almost two-fold decreased affinity to the antibody compared to the target (log2_KD_FC = -0.9). However, the expression level of its source was at the same target’s level with elevated level in the liver and epididymis (4FC &amp; 2FC respectively) indicating tissue-specific cross-reactivity or side toxicity.</w:t>
       </w:r>
     </w:p>
     <w:p>
@@ -10692,172 +11745,661 @@
         <w:rPr>
           <w:lang w:val="en-US"/>
         </w:rPr>
-        <w:t>This approach addresses a critical limitation in current immunogenicity prediction pipelines: the tendency to filter peptides based solely on presence or absence of experimental validation, potentially excluding novel epitopes that lack prior characterization but may represent genuine immunogenic risks.</w:t>
-      </w:r>
-    </w:p>
-    <w:p>
-      <w:pPr>
-        <w:rPr>
-          <w:lang w:val="en-US"/>
-        </w:rPr>
-      </w:pPr>
-    </w:p>
-    <w:p>
-      <w:pPr>
-        <w:rPr>
-          <w:lang w:val="en-US"/>
-        </w:rPr>
-      </w:pPr>
-      <w:r>
-        <w:rPr>
-          <w:lang w:val="en-US"/>
-        </w:rPr>
-        <w:t xml:space="preserve">Traditional approaches often use experimental validation as a filter, excluding </w:t>
-      </w:r>
-      <w:commentRangeStart w:id="96"/>
-      <w:r>
-        <w:rPr>
-          <w:lang w:val="en-US"/>
-        </w:rPr>
-        <w:t xml:space="preserve">novel </w:t>
-      </w:r>
-      <w:commentRangeEnd w:id="96"/>
-      <w:r>
-        <w:rPr>
-          <w:rStyle w:val="Kommentarzeichen"/>
-          <w:sz w:val="24"/>
-          <w:szCs w:val="24"/>
-          <w:lang w:val="en-US"/>
-        </w:rPr>
-        <w:commentReference w:id="96"/>
-      </w:r>
-      <w:r>
-        <w:rPr>
-          <w:lang w:val="en-US"/>
-        </w:rPr>
-        <w:t>peptides that lack prior evidence. However, this logic risks missing genuinely immunogenic epitopes simply because they haven’t been studied yet. We developed a Bayesian evidence classification system not to rank peptide quality, but to provide transparent context about what is experimentally known versus unknown, allowing researchers to make informed decisions tailored to their specific projects, whether prioritizing known risks or exploring novel epitopes.</w:t>
-      </w:r>
-    </w:p>
-    <w:p>
-      <w:pPr>
-        <w:rPr>
-          <w:lang w:val="en-US"/>
-        </w:rPr>
-      </w:pPr>
-      <w:r>
-        <w:rPr>
-          <w:lang w:val="en-US"/>
-        </w:rPr>
-        <w:t xml:space="preserve">Our experimental observations support the utility of integrating both scoring approaches. Several validated off-target peptides were ranked highly by Multi_features_score but not </w:t>
-      </w:r>
+        <w:t>The importance of TCR mimic (TCRm) therapies has increased substantially in recent years, with the role of HLA in triggering immune responses being increasingly exploited for therapeutic benefit. However, minimizing cross-reactivity through comprehensive off-target prediction and validation remains a crucial aspect of antibody characterization and development.</w:t>
+      </w:r>
+    </w:p>
+    <w:p>
+      <w:pPr>
+        <w:rPr>
+          <w:lang w:val="en-US"/>
+        </w:rPr>
+      </w:pPr>
       <w:r>
         <w:rPr>
           <w:lang w:val="en-US"/>
         </w:rPr>
         <w:lastRenderedPageBreak/>
-        <w:t>Bi_features_score (or vice versa), demonstrating that relying on either metric alone would miss biologically relevant candidates. The disagreement set represents peptides where physicochemical properties may compensate for lower sequence similarity, or where high affinity binding occurs despite suboptimal physicochemical profiles.</w:t>
-      </w:r>
-    </w:p>
-    <w:p>
-      <w:pPr>
-        <w:rPr>
-          <w:lang w:val="en-US"/>
-        </w:rPr>
-      </w:pPr>
-    </w:p>
-    <w:p>
-      <w:pPr>
-        <w:rPr>
-          <w:lang w:val="en-US"/>
-        </w:rPr>
-      </w:pPr>
-      <w:r>
-        <w:rPr>
-          <w:lang w:val="en-US"/>
-        </w:rPr>
-        <w:t>While dimension reduction techniques such as PCA are commonly employed in similar analyses, we found that Euclidean distance on the full feature set provided robust ranking performance with greater interpretability. Future work could explore whether dimensionality reduction improves computational efficiency for larger datasets.</w:t>
-      </w:r>
-    </w:p>
-    <w:p>
-      <w:pPr>
-        <w:rPr>
-          <w:lang w:val="en-US"/>
-        </w:rPr>
-      </w:pPr>
-    </w:p>
-    <w:p>
-      <w:pPr>
-        <w:rPr>
-          <w:lang w:val="en-US"/>
-        </w:rPr>
-      </w:pPr>
-      <w:r>
-        <w:rPr>
-          <w:lang w:val="en-US"/>
-        </w:rPr>
-        <w:t>Rather than viewing these methods as competing, we propose they serve complementary roles in off-target assessment. The Bayesian evidence weighting provides contextual classification and counts for the empirical risk with multi-feature weighted score provides comprehensive risk evaluation incorporating gravy, aromaticity, isoelectric Point, net charge at pH7.4, and aliphatic index, while the Bi-features score offers binding likelihood with sequence similarity. Users can leverage the three to gain a more complete understanding of off-target landscape. Cases of strong disagreement may warrant experimental attention, as they likely represent [biological interpretation].</w:t>
-      </w:r>
-    </w:p>
-    <w:p>
-      <w:pPr>
-        <w:rPr>
-          <w:lang w:val="en-US"/>
-        </w:rPr>
-      </w:pPr>
-    </w:p>
-    <w:p>
-      <w:pPr>
-        <w:rPr>
-          <w:lang w:val="en-US"/>
-        </w:rPr>
-      </w:pPr>
-      <w:r>
-        <w:rPr>
-          <w:lang w:val="en-US"/>
-        </w:rPr>
-        <w:t>Exploratory Gene Ontology analysis of the 26 novel off-targets revealed enrichment in immune-related processes, including toll-like receptor signaling and leukocyte aggregation, as well as oxidative stress response pathways. While functional validation is beyond the scope of this study, these associations suggest that comprehensive off-target profiling may reveal immunomodulatory or stress-response mechanisms not apparent from individual candidate assessment. The functional diversity among off-targets, reflected in the absence of KEGG pathway enrichment, underscores the value of unbiased sequence-based detection over hypothesis-driven approaches.</w:t>
-      </w:r>
-    </w:p>
-    <w:p>
-      <w:pPr>
-        <w:rPr>
-          <w:lang w:val="en-US"/>
-        </w:rPr>
-      </w:pPr>
-    </w:p>
-    <w:p>
-      <w:pPr>
-        <w:rPr>
-          <w:lang w:val="en-US"/>
-        </w:rPr>
-      </w:pPr>
-      <w:r>
-        <w:rPr>
-          <w:lang w:val="en-US"/>
-        </w:rPr>
-        <w:t>Early incorporation of expression data introduces tissue-context bias that can obscure relevant off-targets expressed in unexpected contexts, precisely the peptides most likely to cause unanticipated toxicities. This design enables comprehensive sequence-based coverage while empowering context-appropriate risk assessment, particularly valuable for novel targets or multi-indication development where tissue-specific biology may be incompletely characterized</w:t>
-      </w:r>
-    </w:p>
-    <w:p>
-      <w:pPr>
-        <w:rPr>
-          <w:lang w:val="en-US"/>
-        </w:rPr>
-      </w:pPr>
-    </w:p>
-    <w:p>
-      <w:pPr>
-        <w:rPr>
-          <w:lang w:val="en-US"/>
-        </w:rPr>
-      </w:pPr>
-      <w:r>
-        <w:rPr>
-          <w:highlight w:val="yellow"/>
-          <w:lang w:val="en-US"/>
-        </w:rPr>
-        <w:t>Add EpiPredict to the mix as limitation solution</w:t>
-      </w:r>
+        <w:t xml:space="preserve">Current approaches to off-target assessment rely heavily on peptide selection based on experimental evidence, whether generated from specific peptide pools or obtained from public repositories. While we acknowledge the value of experimental data, using it as a preselection criterion is shortsighted, as it creates a significant blind spot in off-target searches by overlooking potentially novel off-targets that lack prior evidence. Furthermore, public MHC databases exhibit well-documented biases toward high-affinity peptides and specific HLA </w:t>
+      </w:r>
+      <w:r>
+        <w:rPr>
+          <w:lang w:val="en-US"/>
+        </w:rPr>
+        <w:t>alleles and</w:t>
+      </w:r>
+      <w:r>
+        <w:rPr>
+          <w:lang w:val="en-US"/>
+        </w:rPr>
+        <w:t xml:space="preserve"> are heavily context-dependent. This approach risks missing genuinely immunogenic epitopes simply because they have not yet been experimentally characterized.</w:t>
+      </w:r>
+    </w:p>
+    <w:p/>
+    <w:p>
+      <w:pPr>
+        <w:rPr>
+          <w:lang w:val="en-US"/>
+        </w:rPr>
+      </w:pPr>
+      <w:r>
+        <w:rPr>
+          <w:lang w:val="en-US"/>
+        </w:rPr>
+        <w:t xml:space="preserve">Our method, EpiTox, </w:t>
+      </w:r>
+      <w:r>
+        <w:rPr>
+          <w:lang w:val="en-US"/>
+        </w:rPr>
+        <w:t>addresses a critical limitation in current immunogenicity prediction pipelines: the tendency to filter peptides based solely on presence or absence of experimental validation, potentially excluding novel epitopes that lack prior characterization but may represent genuine immunogenic risks.</w:t>
+      </w:r>
+      <w:r>
+        <w:rPr>
+          <w:lang w:val="en-US"/>
+        </w:rPr>
+        <w:t xml:space="preserve"> </w:t>
+      </w:r>
+      <w:r>
+        <w:rPr>
+          <w:lang w:val="en-US"/>
+        </w:rPr>
+        <w:t>W</w:t>
+      </w:r>
+      <w:r>
+        <w:rPr>
+          <w:lang w:val="en-US"/>
+        </w:rPr>
+        <w:t xml:space="preserve">e developed a Bayesian evidence classification system </w:t>
+      </w:r>
+      <w:r>
+        <w:rPr>
+          <w:lang w:val="en-US"/>
+        </w:rPr>
+        <w:t xml:space="preserve">that does </w:t>
+      </w:r>
+      <w:r>
+        <w:rPr>
+          <w:lang w:val="en-US"/>
+        </w:rPr>
+        <w:t xml:space="preserve">not rank </w:t>
+      </w:r>
+      <w:r>
+        <w:rPr>
+          <w:lang w:val="en-US"/>
+        </w:rPr>
+        <w:t xml:space="preserve">the </w:t>
+      </w:r>
+      <w:r>
+        <w:rPr>
+          <w:lang w:val="en-US"/>
+        </w:rPr>
+        <w:t>peptide quality</w:t>
+      </w:r>
+      <w:r>
+        <w:rPr>
+          <w:lang w:val="en-US"/>
+        </w:rPr>
+        <w:t xml:space="preserve"> per se</w:t>
+      </w:r>
+      <w:r>
+        <w:rPr>
+          <w:lang w:val="en-US"/>
+        </w:rPr>
+        <w:t xml:space="preserve"> but</w:t>
+      </w:r>
+      <w:r>
+        <w:rPr>
+          <w:lang w:val="en-US"/>
+        </w:rPr>
+        <w:t xml:space="preserve"> </w:t>
+      </w:r>
+      <w:r>
+        <w:rPr>
+          <w:lang w:val="en-US"/>
+        </w:rPr>
+        <w:t xml:space="preserve">rather </w:t>
+      </w:r>
+      <w:r>
+        <w:rPr>
+          <w:lang w:val="en-US"/>
+        </w:rPr>
+        <w:t>provide</w:t>
+      </w:r>
+      <w:r>
+        <w:rPr>
+          <w:lang w:val="en-US"/>
+        </w:rPr>
+        <w:t>s</w:t>
+      </w:r>
+      <w:r>
+        <w:rPr>
+          <w:lang w:val="en-US"/>
+        </w:rPr>
+        <w:t xml:space="preserve"> transparent context about what is experimentally known versus</w:t>
+      </w:r>
+      <w:r>
+        <w:rPr>
+          <w:lang w:val="en-US"/>
+        </w:rPr>
+        <w:t xml:space="preserve"> unknown. This framework </w:t>
+      </w:r>
+      <w:r>
+        <w:rPr>
+          <w:lang w:val="en-US"/>
+        </w:rPr>
+        <w:t>allow</w:t>
+      </w:r>
+      <w:r>
+        <w:rPr>
+          <w:lang w:val="en-US"/>
+        </w:rPr>
+        <w:t>s</w:t>
+      </w:r>
+      <w:r>
+        <w:rPr>
+          <w:lang w:val="en-US"/>
+        </w:rPr>
+        <w:t xml:space="preserve"> researchers to make informed decisions tailored to their specific projects, whether prioritizing known risks or exploring novel epitopes</w:t>
+      </w:r>
+      <w:r>
+        <w:rPr>
+          <w:lang w:val="en-US"/>
+        </w:rPr>
+        <w:t>.</w:t>
+      </w:r>
+    </w:p>
+    <w:p>
+      <w:pPr>
+        <w:pStyle w:val="whitespace-normal"/>
+        <w:rPr>
+          <w:lang w:val="en-US"/>
+        </w:rPr>
+      </w:pPr>
+      <w:r>
+        <w:rPr>
+          <w:lang w:val="en-US"/>
+        </w:rPr>
+        <w:t>Regarding the integration of genetic variation, current approaches focus primarily on trait-associated SNPs (TAS)</w:t>
+      </w:r>
+      <w:r>
+        <w:rPr>
+          <w:lang w:val="en-US"/>
+        </w:rPr>
+        <w:t xml:space="preserve">, i.e., </w:t>
+      </w:r>
+      <w:r>
+        <w:rPr>
+          <w:lang w:val="en-US"/>
+        </w:rPr>
+        <w:t xml:space="preserve">genetic mutations with established associations to specific diseases or cancer </w:t>
+      </w:r>
+      <w:r>
+        <w:rPr>
+          <w:lang w:val="en-US"/>
+        </w:rPr>
+        <w:t>types and</w:t>
+      </w:r>
+      <w:r>
+        <w:rPr>
+          <w:lang w:val="en-US"/>
+        </w:rPr>
+        <w:t xml:space="preserve"> use them as filtering criteria to include or exclude peptides. In risk assessment scenarios, we argue that SNPs should be prioritized and used as peptide-inclusion criteria rather than exclusion criteria. SNPs have been widely used to explain ethnicity-specific phenotypes, many of which are not readily observable. It is surprising that despite the central role of HLA in these therapies, this important aspect has not been effectively implemented as a standard practice. We therefore integrated this logic into our standard workflows, and our data demonstrate that these SNPs can lead to unintended binding events that only individuals carrying specific SNPs will experience.</w:t>
+      </w:r>
+    </w:p>
+    <w:p>
+      <w:pPr>
+        <w:rPr>
+          <w:lang w:val="en-US"/>
+        </w:rPr>
+      </w:pPr>
+      <w:r>
+        <w:rPr>
+          <w:lang w:val="en-US"/>
+        </w:rPr>
+        <w:t xml:space="preserve">Another </w:t>
+      </w:r>
+      <w:r>
+        <w:rPr>
+          <w:lang w:val="en-US"/>
+        </w:rPr>
+        <w:t>limitation</w:t>
+      </w:r>
+      <w:r>
+        <w:rPr>
+          <w:lang w:val="en-US"/>
+        </w:rPr>
+        <w:t xml:space="preserve"> we </w:t>
+      </w:r>
+      <w:r>
+        <w:rPr>
+          <w:lang w:val="en-US"/>
+        </w:rPr>
+        <w:t xml:space="preserve">identified </w:t>
+      </w:r>
+      <w:r>
+        <w:rPr>
+          <w:lang w:val="en-US"/>
+        </w:rPr>
+        <w:t xml:space="preserve">is </w:t>
+      </w:r>
+      <w:r>
+        <w:rPr>
+          <w:lang w:val="en-US"/>
+        </w:rPr>
+        <w:t>the reliance on a single ranking metric that attempts to encapsulate all features and logic. We believe this oversimplifies the problem, as cross-reactivity is inherently complex, and the relevance of different features varies depending on the therapeutic context and target selection. Therefore, we not only incorporated empirical risk (experimental evidence) but also established two distinct scoring systems: a Bi-feature score and a Multi-feature score. Each captures different aspects of peptide similarity and ranks peptides differently, highlighting distinct facets of similarity to the target that could potentially confuse antibody recognition.</w:t>
+      </w:r>
+    </w:p>
+    <w:p>
+      <w:pPr>
+        <w:rPr>
+          <w:lang w:val="en-US"/>
+        </w:rPr>
+      </w:pPr>
+    </w:p>
+    <w:p>
+      <w:pPr>
+        <w:rPr>
+          <w:lang w:val="en-US"/>
+        </w:rPr>
+      </w:pPr>
+      <w:r>
+        <w:rPr>
+          <w:lang w:val="en-US"/>
+        </w:rPr>
+        <w:t xml:space="preserve">Rather than viewing these methods as competing, we propose they serve complementary roles in off-target assessment. The Bayesian evidence weighting provides contextual classification and counts for the empirical risk with multi-feature weighted score provides comprehensive risk evaluation incorporating gravy, aromaticity, isoelectric Point, net charge at pH7.4, and aliphatic index, while the Bi-features score offers </w:t>
+      </w:r>
+      <w:r>
+        <w:rPr>
+          <w:lang w:val="en-US"/>
+        </w:rPr>
+        <w:t xml:space="preserve">HLA </w:t>
+      </w:r>
+      <w:r>
+        <w:rPr>
+          <w:lang w:val="en-US"/>
+        </w:rPr>
+        <w:t>binding likelihood with sequence similarity. Users can leverage the three to gain a more complete understanding of off-target landscape. Cases of strong disagreement may warrant experimental attention, as they likely represent</w:t>
+      </w:r>
+      <w:r>
+        <w:rPr>
+          <w:lang w:val="en-US"/>
+        </w:rPr>
+        <w:t xml:space="preserve"> side toxicity. We also </w:t>
+      </w:r>
+      <w:r>
+        <w:rPr>
+          <w:lang w:val="en-US"/>
+        </w:rPr>
+        <w:t>provide</w:t>
+      </w:r>
+      <w:r>
+        <w:rPr>
+          <w:lang w:val="en-US"/>
+        </w:rPr>
+        <w:t xml:space="preserve"> a decision matrix as a </w:t>
+      </w:r>
+      <w:r>
+        <w:rPr>
+          <w:lang w:val="en-US"/>
+        </w:rPr>
+        <w:t xml:space="preserve">practical </w:t>
+      </w:r>
+      <w:r>
+        <w:rPr>
+          <w:lang w:val="en-US"/>
+        </w:rPr>
+        <w:t>roadmap</w:t>
+      </w:r>
+      <w:r>
+        <w:rPr>
+          <w:lang w:val="en-US"/>
+        </w:rPr>
+        <w:t xml:space="preserve"> for interpretation</w:t>
+      </w:r>
+      <w:r>
+        <w:rPr>
+          <w:lang w:val="en-US"/>
+        </w:rPr>
+        <w:t xml:space="preserve">.  </w:t>
+      </w:r>
+    </w:p>
+    <w:p>
+      <w:pPr>
+        <w:rPr>
+          <w:lang w:val="en-US"/>
+        </w:rPr>
+      </w:pPr>
+    </w:p>
+    <w:p>
+      <w:pPr>
+        <w:rPr>
+          <w:lang w:val="en-US"/>
+        </w:rPr>
+      </w:pPr>
+      <w:r>
+        <w:rPr>
+          <w:lang w:val="en-US"/>
+        </w:rPr>
+        <w:t xml:space="preserve">While dimension reduction techniques such as PCA are commonly employed in similar analyses, we found that Euclidean distance on the full feature set provided robust ranking </w:t>
+      </w:r>
+      <w:r>
+        <w:rPr>
+          <w:lang w:val="en-US"/>
+        </w:rPr>
+        <w:lastRenderedPageBreak/>
+        <w:t xml:space="preserve">performance with greater interpretability. Future work could explore whether dimensionality reduction improves computational efficiency </w:t>
+      </w:r>
+      <w:r>
+        <w:rPr>
+          <w:lang w:val="en-US"/>
+        </w:rPr>
+        <w:t>depending on the experimental setup</w:t>
+      </w:r>
+      <w:r>
+        <w:rPr>
+          <w:lang w:val="en-US"/>
+        </w:rPr>
+        <w:t>.</w:t>
+      </w:r>
+    </w:p>
+    <w:p>
+      <w:pPr>
+        <w:rPr>
+          <w:lang w:val="en-US"/>
+        </w:rPr>
+      </w:pPr>
+    </w:p>
+    <w:p>
+      <w:pPr>
+        <w:rPr>
+          <w:lang w:val="en-US"/>
+        </w:rPr>
+      </w:pPr>
+      <w:r>
+        <w:rPr>
+          <w:lang w:val="en-US"/>
+        </w:rPr>
+        <w:t xml:space="preserve">We demonstrated the capability of EpiTox via MAGEA3 as a case study. We </w:t>
+      </w:r>
+      <w:r>
+        <w:rPr>
+          <w:lang w:val="en-US"/>
+        </w:rPr>
+        <w:t xml:space="preserve">successfully </w:t>
+      </w:r>
+      <w:r>
+        <w:rPr>
+          <w:lang w:val="en-US"/>
+        </w:rPr>
+        <w:t>identif</w:t>
+      </w:r>
+      <w:r>
+        <w:rPr>
+          <w:lang w:val="en-US"/>
+        </w:rPr>
+        <w:t>ied</w:t>
+      </w:r>
+      <w:r>
+        <w:rPr>
+          <w:lang w:val="en-US"/>
+        </w:rPr>
+        <w:t xml:space="preserve"> and validate 37 off-targets, of which 26 are new peptides in the context of MAGEA3.   </w:t>
+      </w:r>
+    </w:p>
+    <w:p>
+      <w:pPr>
+        <w:rPr>
+          <w:lang w:val="en-US"/>
+        </w:rPr>
+      </w:pPr>
+    </w:p>
+    <w:p>
+      <w:pPr>
+        <w:rPr>
+          <w:lang w:val="en-US"/>
+        </w:rPr>
+      </w:pPr>
+      <w:r>
+        <w:rPr>
+          <w:lang w:val="en-US"/>
+        </w:rPr>
+        <w:t xml:space="preserve">Exploratory Gene Ontology analysis of the 26 novel off-targets revealed enrichment in immune-related processes, including toll-like receptor signaling and leukocyte aggregation, as well as oxidative stress response pathways. While functional validation is beyond the scope of this study, these associations suggest that comprehensive off-target profiling may reveal immunomodulatory or stress-response mechanisms not apparent from individual candidate assessment. The functional diversity among off-targets, reflected in the absence of KEGG pathway enrichment, </w:t>
+      </w:r>
+      <w:r>
+        <w:rPr>
+          <w:lang w:val="en-US"/>
+        </w:rPr>
+        <w:t>highlights</w:t>
+      </w:r>
+      <w:r>
+        <w:rPr>
+          <w:lang w:val="en-US"/>
+        </w:rPr>
+        <w:t xml:space="preserve"> the value of unbiased sequence-based detection over hypothesis-driven approaches.</w:t>
+      </w:r>
+    </w:p>
+    <w:p>
+      <w:pPr>
+        <w:rPr>
+          <w:lang w:val="en-US"/>
+        </w:rPr>
+      </w:pPr>
+    </w:p>
+    <w:p>
+      <w:pPr>
+        <w:rPr>
+          <w:lang w:val="en-US"/>
+        </w:rPr>
+      </w:pPr>
+      <w:r>
+        <w:rPr>
+          <w:lang w:val="en-US"/>
+        </w:rPr>
+        <w:t>We intentionally avoid early incorporation of expression data, as this introduces tissue-context bias that can obscure relevant off-targets expressed in unexpected context</w:t>
+      </w:r>
+      <w:r>
+        <w:rPr>
+          <w:lang w:val="en-US"/>
+        </w:rPr>
+        <w:t xml:space="preserve">s </w:t>
+      </w:r>
+      <w:r>
+        <w:rPr>
+          <w:lang w:val="en-US"/>
+        </w:rPr>
+        <w:t>precisely the peptides most likely to cause unanticipated toxicities. This design enables comprehensive sequence-based coverage while empowering context-appropriate risk assessment, an approach particularly valuable for novel targets or multi-indication development programs where tissue-specific biology may be incompletely characterized.</w:t>
+      </w:r>
+    </w:p>
+    <w:p>
+      <w:pPr>
+        <w:rPr>
+          <w:lang w:val="en-US"/>
+        </w:rPr>
+      </w:pPr>
+    </w:p>
+    <w:p>
+      <w:pPr>
+        <w:rPr>
+          <w:lang w:val="en-US"/>
+        </w:rPr>
+      </w:pPr>
+      <w:r>
+        <w:rPr>
+          <w:lang w:val="en-US"/>
+        </w:rPr>
+        <w:t>Finally, we acknowledge</w:t>
+      </w:r>
+      <w:r>
+        <w:rPr>
+          <w:lang w:val="en-US"/>
+        </w:rPr>
+        <w:t xml:space="preserve"> that</w:t>
+      </w:r>
+      <w:r>
+        <w:rPr>
+          <w:lang w:val="en-US"/>
+        </w:rPr>
+        <w:t xml:space="preserve"> even with </w:t>
+      </w:r>
+      <w:r>
+        <w:rPr>
+          <w:lang w:val="en-US"/>
+        </w:rPr>
+        <w:t>maximum</w:t>
+      </w:r>
+      <w:r>
+        <w:rPr>
+          <w:lang w:val="en-US"/>
+        </w:rPr>
+        <w:t xml:space="preserve"> </w:t>
+      </w:r>
+      <w:r>
+        <w:rPr>
+          <w:lang w:val="en-US"/>
+        </w:rPr>
+        <w:t xml:space="preserve">flexibility in </w:t>
+      </w:r>
+      <w:r>
+        <w:rPr>
+          <w:lang w:val="en-US"/>
+        </w:rPr>
+        <w:t>search</w:t>
+      </w:r>
+      <w:r>
+        <w:rPr>
+          <w:lang w:val="en-US"/>
+        </w:rPr>
+        <w:t xml:space="preserve"> parameters, search</w:t>
+      </w:r>
+      <w:r>
+        <w:rPr>
+          <w:lang w:val="en-US"/>
+        </w:rPr>
+        <w:t xml:space="preserve">ing off-targets based on sequence similarity </w:t>
+      </w:r>
+      <w:r>
+        <w:rPr>
+          <w:lang w:val="en-US"/>
+        </w:rPr>
+        <w:t>inherently represents</w:t>
+      </w:r>
+      <w:r>
+        <w:rPr>
+          <w:lang w:val="en-US"/>
+        </w:rPr>
+        <w:t xml:space="preserve"> a founder effect</w:t>
+      </w:r>
+      <w:r>
+        <w:rPr>
+          <w:lang w:val="en-US"/>
+        </w:rPr>
+        <w:t xml:space="preserve">: </w:t>
+      </w:r>
+      <w:r>
+        <w:rPr>
+          <w:lang w:val="en-US"/>
+        </w:rPr>
+        <w:t>peptides with high dissimilarity beyond established cutoff</w:t>
+      </w:r>
+      <w:r>
+        <w:rPr>
+          <w:lang w:val="en-US"/>
+        </w:rPr>
+        <w:t>s</w:t>
+      </w:r>
+      <w:r>
+        <w:rPr>
+          <w:lang w:val="en-US"/>
+        </w:rPr>
+        <w:t xml:space="preserve"> will be missed. </w:t>
+      </w:r>
+      <w:r>
+        <w:rPr>
+          <w:lang w:val="en-US"/>
+        </w:rPr>
+        <w:t xml:space="preserve">To address this limitation in </w:t>
+      </w:r>
+      <w:r>
+        <w:rPr>
+          <w:lang w:val="en-US"/>
+        </w:rPr>
+        <w:t xml:space="preserve"> our off-target risk assessment pipeline, we </w:t>
+      </w:r>
+      <w:r>
+        <w:rPr>
+          <w:lang w:val="en-US"/>
+        </w:rPr>
+        <w:t>previously</w:t>
+      </w:r>
+      <w:r>
+        <w:rPr>
+          <w:lang w:val="en-US"/>
+        </w:rPr>
+        <w:t xml:space="preserve"> </w:t>
+      </w:r>
+      <w:r>
+        <w:rPr>
+          <w:lang w:val="en-US"/>
+        </w:rPr>
+        <w:t>introduced, EpiPredict, a</w:t>
+      </w:r>
+      <w:r>
+        <w:rPr>
+          <w:lang w:val="en-US"/>
+        </w:rPr>
+        <w:t xml:space="preserve"> machine learning-based </w:t>
+      </w:r>
+      <w:r>
+        <w:rPr>
+          <w:lang w:val="en-US"/>
+        </w:rPr>
+        <w:t xml:space="preserve">approach </w:t>
+      </w:r>
+      <w:r>
+        <w:rPr>
+          <w:lang w:val="en-US"/>
+        </w:rPr>
+        <w:t>specifically designed to overcome this challenge</w:t>
+      </w:r>
+      <w:r>
+        <w:rPr>
+          <w:lang w:val="en-US"/>
+        </w:rPr>
+        <w:t xml:space="preserve"> [CITE]. </w:t>
+      </w:r>
+    </w:p>
+    <w:p>
+      <w:pPr>
+        <w:rPr>
+          <w:lang w:val="en-US"/>
+        </w:rPr>
+      </w:pPr>
+    </w:p>
+    <w:p>
+      <w:pPr>
+        <w:rPr>
+          <w:lang w:val="en-US"/>
+        </w:rPr>
+      </w:pPr>
+      <w:r>
+        <w:rPr>
+          <w:lang w:val="en-US"/>
+        </w:rPr>
+        <w:t>And with this I think we are awesome</w:t>
+      </w:r>
+      <w:r>
+        <w:rPr>
+          <w:lang w:val="en-US"/>
+        </w:rPr>
+        <w:t xml:space="preserve"> :D</w:t>
+      </w:r>
+    </w:p>
+    <w:p>
+      <w:pPr>
+        <w:rPr>
+          <w:lang w:val="en-US"/>
+        </w:rPr>
+      </w:pPr>
     </w:p>
     <w:p>
       <w:pPr>
@@ -10924,7 +12466,6 @@
           <w:rFonts w:eastAsia="Times New Roman"/>
           <w:lang w:eastAsia="en-GB"/>
         </w:rPr>
-        <w:lastRenderedPageBreak/>
         <w:t>Conflict of interest</w:t>
       </w:r>
     </w:p>
@@ -10952,6 +12493,7 @@
         </w:rPr>
       </w:pPr>
       <w:r>
+        <w:lastRenderedPageBreak/>
         <w:t>Code</w:t>
       </w:r>
       <w:r>
@@ -11951,25 +13493,6 @@
           <w:lang w:val="en-US" w:eastAsia="en-US"/>
         </w:rPr>
         <w:t>you need to add the protein location to make it understandable</w:t>
-      </w:r>
-    </w:p>
-  </w:comment>
-  <w:comment w:id="96" w:author="Hoor Al-Hasani" w:date="2025-10-22T14:42:00Z" w:initials="HAH">
-    <w:p>
-      <w:r>
-        <w:rPr>
-          <w:rStyle w:val="Kommentarzeichen"/>
-        </w:rPr>
-        <w:annotationRef/>
-      </w:r>
-      <w:r>
-        <w:rPr>
-          <w:rFonts w:asciiTheme="minorHAnsi" w:eastAsiaTheme="minorHAnsi" w:hAnsiTheme="minorHAnsi" w:cstheme="minorBidi"/>
-          <w:sz w:val="20"/>
-          <w:szCs w:val="20"/>
-          <w:lang w:val="en-US" w:eastAsia="en-US"/>
-        </w:rPr>
-        <w:t xml:space="preserve">novel = unknown in public DBs </w:t>
       </w:r>
     </w:p>
   </w:comment>
@@ -12010,7 +13533,6 @@
   <w15:commentEx w15:paraId="3F34560A" w15:done="0"/>
   <w15:commentEx w15:paraId="55D5A615" w15:done="0"/>
   <w15:commentEx w15:paraId="0051556A" w15:done="0"/>
-  <w15:commentEx w15:paraId="4B46788F" w15:done="0"/>
 </w15:commentsEx>
 </file>
 
@@ -12048,7 +13570,6 @@
   <w16cex:commentExtensible w16cex:durableId="1BF41AEB" w16cex:dateUtc="2025-11-02T12:10:00Z"/>
   <w16cex:commentExtensible w16cex:durableId="03416A8B" w16cex:dateUtc="2025-11-02T13:05:00Z"/>
   <w16cex:commentExtensible w16cex:durableId="5265C79E" w16cex:dateUtc="2025-11-02T01:07:00Z"/>
-  <w16cex:commentExtensible w16cex:durableId="36D8352D" w16cex:dateUtc="2025-10-22T12:42:00Z"/>
 </w16cex:commentsExtensible>
 </file>
 
@@ -12086,7 +13607,6 @@
   <w16cid:commentId w16cid:paraId="3F34560A" w16cid:durableId="1BF41AEB"/>
   <w16cid:commentId w16cid:paraId="55D5A615" w16cid:durableId="03416A8B"/>
   <w16cid:commentId w16cid:paraId="0051556A" w16cid:durableId="5265C79E"/>
-  <w16cid:commentId w16cid:paraId="4B46788F" w16cid:durableId="36D8352D"/>
 </w16cid:commentsIds>
 </file>
 
@@ -16948,7 +18468,6 @@
   <w:style w:type="character" w:default="1" w:styleId="Absatz-Standardschriftart">
     <w:name w:val="Default Paragraph Font"/>
     <w:uiPriority w:val="1"/>
-    <w:semiHidden/>
     <w:unhideWhenUsed/>
   </w:style>
   <w:style w:type="table" w:default="1" w:styleId="NormaleTabelle">

</xml_diff>